<commit_message>
CED: resposta à requerente de Setúbal, versão final do utilizador
Exposição à Câmara Municipal integrada no ponto 5.

Co-Authored-By: Claude Opus 5.5 <noreply@anthropic.com>
Claude-Session: https://claude.ai/code/session_013gc37ZfszD9QAJQ5M1gWcB
</commit_message>
<xml_diff>
--- a/CED/Resposta_CED_Setubal_acolhimento_2026-10-08.docx
+++ b/CED/Resposta_CED_Setubal_acolhimento_2026-10-08.docx
@@ -15,7 +15,7 @@
         <w:jc w:val="both"/>
       </w:pPr>
       <w:r>
-        <w:t>Acusa-se a receção da sua comunicação, que mereceu a nossa melhor atenção e sobre a qual cumpre esclarecer o seguinte.</w:t>
+        <w:t>Acusa-se a receção da sua comunicação, que mereceu a nossa melhor atenção e sobre a qual cumpre esclarecer o seguinte:</w:t>
       </w:r>
     </w:p>
     <w:p>
@@ -33,7 +33,7 @@
         <w:jc w:val="both"/>
       </w:pPr>
       <w:r>
-        <w:t>a) as câmaras municipais podem, «sob parecer do médico veterinário municipal, autorizar a manutenção, em locais especialmente designados para o efeito, de colónias de gatos» (n.º 1);</w:t>
+        <w:t>a) As câmaras municipais podem, «sob parecer do médico veterinário municipal, autorizar a manutenção, em locais especialmente designados para o efeito, de colónias de gatos» (n.º 1);</w:t>
       </w:r>
     </w:p>
     <w:p>
@@ -43,7 +43,7 @@
         <w:jc w:val="both"/>
       </w:pPr>
       <w:r>
-        <w:t>b) o programa realiza-se «por iniciativa das câmaras municipais ou mediante proposta de organização de proteção animal a quem a câmara municipal atribua a gestão do programa CED» (n.º 2);</w:t>
+        <w:t>b) O programa realiza-se «por iniciativa das câmaras municipais ou mediante proposta de organização de proteção animal a quem a câmara municipal atribua a gestão do programa CED» (n.º 2);</w:t>
       </w:r>
     </w:p>
     <w:p>
@@ -53,7 +53,7 @@
         <w:jc w:val="both"/>
       </w:pPr>
       <w:r>
-        <w:t>c) a entidade responsável assegura a existência de «um plano de gestão da colónia, do qual conste a identificação do médico veterinário assistente e das pessoas que na entidade são responsáveis pela execução do programa» (alínea a) do n.º 4);</w:t>
+        <w:t>c) A entidade responsável assegura a existência de «um plano de gestão da colónia, do qual conste a identificação do médico veterinário assistente e das pessoas que na entidade são responsáveis pela execução do programa» (alínea a) do n.º 4);</w:t>
       </w:r>
     </w:p>
     <w:p>
@@ -63,7 +63,7 @@
         <w:jc w:val="both"/>
       </w:pPr>
       <w:r>
-        <w:t>d) os animais capturados, «antes de integrarem a colónia, são entregues nos CRO para verificação da sua aptidão» (alínea d) do n.º 4);</w:t>
+        <w:t>d) Os animais capturados, «antes de integrarem a colónia, são entregues nos CRO para verificação da sua aptidão» (alínea d) do n.º 4);</w:t>
       </w:r>
     </w:p>
     <w:p>
@@ -73,7 +73,7 @@
         <w:jc w:val="both"/>
       </w:pPr>
       <w:r>
-        <w:t>e) a colónia «será supervisionada pelo médico veterinário municipal» (n.º 5).</w:t>
+        <w:t>e) A colónia «será supervisionada pelo médico veterinário municipal» (n.º 5).</w:t>
       </w:r>
     </w:p>
     <w:p>
@@ -105,7 +105,7 @@
         <w:jc w:val="both"/>
       </w:pPr>
       <w:r>
-        <w:t>Quanto ao ponto 5, informa-se que a presença de animais errantes deve ser comunicada aos serviços municipais, aos quais os animais podem ser entregues por quem os tenha capturado, nos termos do n.º 2 do artigo 7.º da Portaria n.º 146/2017, de 26 de abril. O procedimento adequado passa, assim, por solicitar a intervenção do respetivo município, recomendando-se a articulação com esta entidade para avaliação da situação e adoção das medidas adequadas à prevenção da reprodução destes animais, realidade que se reconhece como indesejável. Atendendo ao período decorrido desde o contacto inicial que refere ter efetuado, considera-se pertinente solicitar uma apreciação atualizada da situação dos nove animais e da viabilidade da sua integração no programa CED da colónia de origem.</w:t>
+        <w:t>Quanto ao ponto 5, informa-se que a presença de animais errantes deve ser comunicada aos serviços municipais, aos quais os animais podem ser entregues por quem os tenha capturado, nos termos do n.º 2 do artigo 7.º da Portaria n.º 146/2017, de 26 de abril. Recomenda-se assim a articulação com esta entidade para avaliação da situação e adoção das medidas adequadas à prevenção da reprodução destes animais, realidade que se reconhece como indesejável. Atendendo ao período decorrido desde o contacto inicial que refere ter efetuado, considera-se pertinente solicitar uma apreciação atualizada da situação dos nove animais. Caso considere que a situação não foi objeto de acompanhamento adequado pelos serviços municipais, poderá dirigir uma exposição à Câmara Municipal de Setúbal, solicitando a apreciação dos factos, sem prejuízo do recurso aos meios de reclamação legalmente disponíveis.</w:t>
       </w:r>
     </w:p>
     <w:p>
@@ -122,14 +122,6 @@
       </w:pPr>
       <w:r>
         <w:t>Quanto ao ponto 6, relativo aos incentivos financeiros de 2026 destinados ao bem-estar animal, informa-se que ainda decorre a análise das candidaturas apresentadas entre 1 de julho e 31 de agosto de 2026 ao abrigo do Aviso n.º 2/2026 DGAV-DSBEA, relativo à prestação de serviços veterinários e à alimentação de animais, incluindo os integrados em colónias registadas ao abrigo de programas CED, e do Aviso n.º 3/2026 DGAV-DSBEA, relativo ao apoio à esterilização de animais de companhia. A informação sobre as candidaturas e os apoios atribuídos, discriminada por município, só estará disponível depois de concluída essa análise.</w:t>
-      </w:r>
-    </w:p>
-    <w:p>
-      <w:pPr>
-        <w:jc w:val="both"/>
-      </w:pPr>
-      <w:r>
-        <w:t>Caso considere que a situação não foi objeto de acompanhamento adequado pelos serviços municipais, poderá dirigir uma exposição à Câmara Municipal de Setúbal, solicitando a apreciação dos factos, sem prejuízo do recurso aos meios de reclamação legalmente disponíveis.</w:t>
       </w:r>
     </w:p>
     <w:p>

</xml_diff>